<commit_message>
docs: actualizar manual de arquitectura SIGI V01 con seccion 8 de ergonomia responsiva y regenerar docx/doc
</commit_message>
<xml_diff>
--- a/apps/corpoelec-sigi-gestion-planificacion-distribucion/docs/NAC_2026_GGPD_MANUAL_SISTEMA_ARQUITECTURA_SIGI_V01.docx
+++ b/apps/corpoelec-sigi-gestion-planificacion-distribucion/docs/NAC_2026_GGPD_MANUAL_SISTEMA_ARQUITECTURA_SIGI_V01.docx
@@ -3513,6 +3513,1106 @@
           <w:szCs w:val="18"/>
         </w:rPr>
         <w:t xml:space="preserve"> distribucion-corpoelec-automatizacion &lt;ggpd.automatizacion.corpoelec@gmail.com&gt; </w:t>
+      </w:r>
+    </w:p>
+    <w:p>
+      <w:pPr>
+        <w:pBdr>
+          <w:bottom w:val="single" w:color="CBD5E1" w:sz="6" w:space="1"/>
+        </w:pBdr>
+        <w:spacing w:after="120" w:before="120"/>
+      </w:pPr>
+    </w:p>
+    <w:p>
+      <w:pPr>
+        <w:pStyle w:val="Heading2"/>
+        <w:spacing w:after="100" w:before="200"/>
+      </w:pPr>
+      <w:r>
+        <w:rPr>
+          <w:rFonts w:ascii="Calibri" w:cs="Calibri" w:eastAsia="Calibri" w:hAnsi="Calibri"/>
+          <w:b/>
+          <w:bCs/>
+          <w:color w:val="004488"/>
+          <w:sz w:val="26"/>
+          <w:szCs w:val="26"/>
+        </w:rPr>
+        <w:t xml:space="preserve">📱 8. ARQUITECTURA RESPONSIVA Y ERGONOMÍA MULTI-DISPOSITIVO</w:t>
+      </w:r>
+    </w:p>
+    <w:p>
+      <w:pPr>
+        <w:spacing w:after="80" w:before="60"/>
+      </w:pPr>
+      <w:r>
+        <w:rPr>
+          <w:rFonts w:ascii="Calibri" w:cs="Calibri" w:eastAsia="Calibri" w:hAnsi="Calibri"/>
+          <w:b w:val="false"/>
+          <w:bCs w:val="false"/>
+          <w:color w:val="1E293B"/>
+          <w:sz w:val="20"/>
+          <w:szCs w:val="20"/>
+        </w:rPr>
+        <w:t xml:space="preserve">La interfaz de usuario del SIGI incorpora un sistema de diseño adaptable de grado industrial optimizado para tres perfiles de pantalla:</w:t>
+      </w:r>
+    </w:p>
+    <w:tbl>
+      <w:tblPr>
+        <w:tblW w:type="pct" w:w="100%"/>
+        <w:tblBorders>
+          <w:top w:val="single" w:color="auto" w:sz="4"/>
+          <w:left w:val="single" w:color="auto" w:sz="4"/>
+          <w:bottom w:val="single" w:color="auto" w:sz="4"/>
+          <w:right w:val="single" w:color="auto" w:sz="4"/>
+          <w:insideH w:val="single" w:color="auto" w:sz="4"/>
+          <w:insideV w:val="single" w:color="auto" w:sz="4"/>
+        </w:tblBorders>
+        <w:tblLayout w:type="autofit"/>
+      </w:tblPr>
+      <w:tblGrid>
+        <w:gridCol w:w="100"/>
+        <w:gridCol w:w="100"/>
+        <w:gridCol w:w="100"/>
+        <w:gridCol w:w="100"/>
+        <w:gridCol w:w="100"/>
+      </w:tblGrid>
+      <w:tr>
+        <w:trPr>
+          <w:cantSplit/>
+          <w:tblHeader/>
+        </w:trPr>
+        <w:tc>
+          <w:tcPr>
+            <w:tcBorders>
+              <w:top w:val="single" w:color="CBD5E1" w:sz="4"/>
+              <w:left w:val="single" w:color="CBD5E1" w:sz="4"/>
+              <w:bottom w:val="single" w:color="CBD5E1" w:sz="4"/>
+              <w:right w:val="single" w:color="CBD5E1" w:sz="4"/>
+            </w:tcBorders>
+            <w:shd w:fill="002B49" w:val="clear"/>
+            <w:tcMar>
+              <w:top w:type="dxa" w:w="120"/>
+              <w:left w:type="dxa" w:w="140"/>
+              <w:bottom w:type="dxa" w:w="120"/>
+              <w:right w:type="dxa" w:w="140"/>
+            </w:tcMar>
+          </w:tcPr>
+          <w:p>
+            <w:pPr>
+              <w:spacing w:after="80" w:before="80"/>
+              <w:jc w:val="left"/>
+            </w:pPr>
+            <w:r>
+              <w:rPr>
+                <w:rFonts w:ascii="Calibri" w:cs="Calibri" w:eastAsia="Calibri" w:hAnsi="Calibri"/>
+                <w:b/>
+                <w:bCs/>
+                <w:color w:val="FFFFFF"/>
+                <w:sz w:val="19"/>
+                <w:szCs w:val="19"/>
+              </w:rPr>
+              <w:t xml:space="preserve">Perfil de Dispositivo</w:t>
+            </w:r>
+          </w:p>
+        </w:tc>
+        <w:tc>
+          <w:tcPr>
+            <w:tcBorders>
+              <w:top w:val="single" w:color="CBD5E1" w:sz="4"/>
+              <w:left w:val="single" w:color="CBD5E1" w:sz="4"/>
+              <w:bottom w:val="single" w:color="CBD5E1" w:sz="4"/>
+              <w:right w:val="single" w:color="CBD5E1" w:sz="4"/>
+            </w:tcBorders>
+            <w:shd w:fill="002B49" w:val="clear"/>
+            <w:tcMar>
+              <w:top w:type="dxa" w:w="120"/>
+              <w:left w:type="dxa" w:w="140"/>
+              <w:bottom w:type="dxa" w:w="120"/>
+              <w:right w:type="dxa" w:w="140"/>
+            </w:tcMar>
+          </w:tcPr>
+          <w:p>
+            <w:pPr>
+              <w:spacing w:after="80" w:before="80"/>
+              <w:jc w:val="left"/>
+            </w:pPr>
+            <w:r>
+              <w:rPr>
+                <w:rFonts w:ascii="Calibri" w:cs="Calibri" w:eastAsia="Calibri" w:hAnsi="Calibri"/>
+                <w:b/>
+                <w:bCs/>
+                <w:color w:val="FFFFFF"/>
+                <w:sz w:val="19"/>
+                <w:szCs w:val="19"/>
+              </w:rPr>
+              <w:t xml:space="preserve">Rango de Resolución</w:t>
+            </w:r>
+          </w:p>
+        </w:tc>
+        <w:tc>
+          <w:tcPr>
+            <w:tcBorders>
+              <w:top w:val="single" w:color="CBD5E1" w:sz="4"/>
+              <w:left w:val="single" w:color="CBD5E1" w:sz="4"/>
+              <w:bottom w:val="single" w:color="CBD5E1" w:sz="4"/>
+              <w:right w:val="single" w:color="CBD5E1" w:sz="4"/>
+            </w:tcBorders>
+            <w:shd w:fill="002B49" w:val="clear"/>
+            <w:tcMar>
+              <w:top w:type="dxa" w:w="120"/>
+              <w:left w:type="dxa" w:w="140"/>
+              <w:bottom w:type="dxa" w:w="120"/>
+              <w:right w:type="dxa" w:w="140"/>
+            </w:tcMar>
+          </w:tcPr>
+          <w:p>
+            <w:pPr>
+              <w:spacing w:after="80" w:before="80"/>
+              <w:jc w:val="left"/>
+            </w:pPr>
+            <w:r>
+              <w:rPr>
+                <w:rFonts w:ascii="Calibri" w:cs="Calibri" w:eastAsia="Calibri" w:hAnsi="Calibri"/>
+                <w:b/>
+                <w:bCs/>
+                <w:color w:val="FFFFFF"/>
+                <w:sz w:val="19"/>
+                <w:szCs w:val="19"/>
+              </w:rPr>
+              <w:t xml:space="preserve">Dimensiones Logo CORPOELEC</w:t>
+            </w:r>
+          </w:p>
+        </w:tc>
+        <w:tc>
+          <w:tcPr>
+            <w:tcBorders>
+              <w:top w:val="single" w:color="CBD5E1" w:sz="4"/>
+              <w:left w:val="single" w:color="CBD5E1" w:sz="4"/>
+              <w:bottom w:val="single" w:color="CBD5E1" w:sz="4"/>
+              <w:right w:val="single" w:color="CBD5E1" w:sz="4"/>
+            </w:tcBorders>
+            <w:shd w:fill="002B49" w:val="clear"/>
+            <w:tcMar>
+              <w:top w:type="dxa" w:w="120"/>
+              <w:left w:type="dxa" w:w="140"/>
+              <w:bottom w:type="dxa" w:w="120"/>
+              <w:right w:type="dxa" w:w="140"/>
+            </w:tcMar>
+          </w:tcPr>
+          <w:p>
+            <w:pPr>
+              <w:spacing w:after="80" w:before="80"/>
+              <w:jc w:val="left"/>
+            </w:pPr>
+            <w:r>
+              <w:rPr>
+                <w:rFonts w:ascii="Calibri" w:cs="Calibri" w:eastAsia="Calibri" w:hAnsi="Calibri"/>
+                <w:b/>
+                <w:bCs/>
+                <w:color w:val="FFFFFF"/>
+                <w:sz w:val="19"/>
+                <w:szCs w:val="19"/>
+              </w:rPr>
+              <w:t xml:space="preserve">Header / Navbar</w:t>
+            </w:r>
+          </w:p>
+        </w:tc>
+        <w:tc>
+          <w:tcPr>
+            <w:tcBorders>
+              <w:top w:val="single" w:color="CBD5E1" w:sz="4"/>
+              <w:left w:val="single" w:color="CBD5E1" w:sz="4"/>
+              <w:bottom w:val="single" w:color="CBD5E1" w:sz="4"/>
+              <w:right w:val="single" w:color="CBD5E1" w:sz="4"/>
+            </w:tcBorders>
+            <w:shd w:fill="002B49" w:val="clear"/>
+            <w:tcMar>
+              <w:top w:type="dxa" w:w="120"/>
+              <w:left w:type="dxa" w:w="140"/>
+              <w:bottom w:type="dxa" w:w="120"/>
+              <w:right w:type="dxa" w:w="140"/>
+            </w:tcMar>
+          </w:tcPr>
+          <w:p>
+            <w:pPr>
+              <w:spacing w:after="80" w:before="80"/>
+              <w:jc w:val="left"/>
+            </w:pPr>
+            <w:r>
+              <w:rPr>
+                <w:rFonts w:ascii="Calibri" w:cs="Calibri" w:eastAsia="Calibri" w:hAnsi="Calibri"/>
+                <w:b/>
+                <w:bCs/>
+                <w:color w:val="FFFFFF"/>
+                <w:sz w:val="19"/>
+                <w:szCs w:val="19"/>
+              </w:rPr>
+              <w:t xml:space="preserve">Experiencia de Navegación</w:t>
+            </w:r>
+          </w:p>
+        </w:tc>
+      </w:tr>
+      <w:tr>
+        <w:trPr>
+          <w:cantSplit/>
+          <w:tblHeader w:val="false"/>
+        </w:trPr>
+        <w:tc>
+          <w:tcPr>
+            <w:tcBorders>
+              <w:top w:val="single" w:color="CBD5E1" w:sz="4"/>
+              <w:left w:val="single" w:color="CBD5E1" w:sz="4"/>
+              <w:bottom w:val="single" w:color="CBD5E1" w:sz="4"/>
+              <w:right w:val="single" w:color="CBD5E1" w:sz="4"/>
+            </w:tcBorders>
+            <w:shd w:fill="FFFFFF" w:val="clear"/>
+            <w:tcMar>
+              <w:top w:type="dxa" w:w="120"/>
+              <w:left w:type="dxa" w:w="140"/>
+              <w:bottom w:type="dxa" w:w="120"/>
+              <w:right w:type="dxa" w:w="140"/>
+            </w:tcMar>
+          </w:tcPr>
+          <w:p>
+            <w:pPr>
+              <w:spacing w:after="80" w:before="80"/>
+              <w:jc w:val="left"/>
+            </w:pPr>
+            <w:r>
+              <w:rPr>
+                <w:rFonts w:ascii="Calibri" w:cs="Calibri" w:eastAsia="Calibri" w:hAnsi="Calibri"/>
+                <w:b/>
+                <w:bCs/>
+                <w:color w:val="002B49"/>
+                <w:sz w:val="20"/>
+                <w:szCs w:val="20"/>
+              </w:rPr>
+              <w:t xml:space="preserve">Escritorio / PC</w:t>
+            </w:r>
+          </w:p>
+        </w:tc>
+        <w:tc>
+          <w:tcPr>
+            <w:tcBorders>
+              <w:top w:val="single" w:color="CBD5E1" w:sz="4"/>
+              <w:left w:val="single" w:color="CBD5E1" w:sz="4"/>
+              <w:bottom w:val="single" w:color="CBD5E1" w:sz="4"/>
+              <w:right w:val="single" w:color="CBD5E1" w:sz="4"/>
+            </w:tcBorders>
+            <w:shd w:fill="FFFFFF" w:val="clear"/>
+            <w:tcMar>
+              <w:top w:type="dxa" w:w="120"/>
+              <w:left w:type="dxa" w:w="140"/>
+              <w:bottom w:type="dxa" w:w="120"/>
+              <w:right w:type="dxa" w:w="140"/>
+            </w:tcMar>
+          </w:tcPr>
+          <w:p>
+            <w:pPr>
+              <w:spacing w:after="80" w:before="80"/>
+              <w:jc w:val="left"/>
+            </w:pPr>
+            <w:r>
+              <w:rPr>
+                <w:rFonts w:ascii="Consolas" w:cs="Consolas" w:eastAsia="Consolas" w:hAnsi="Consolas"/>
+                <w:b w:val="false"/>
+                <w:bCs w:val="false"/>
+                <w:color w:val="0F172A"/>
+                <w:sz w:val="18"/>
+                <w:szCs w:val="18"/>
+              </w:rPr>
+              <w:t xml:space="preserve"> lg+ </w:t>
+            </w:r>
+            <w:r>
+              <w:rPr>
+                <w:rFonts w:ascii="Calibri" w:cs="Calibri" w:eastAsia="Calibri" w:hAnsi="Calibri"/>
+                <w:b w:val="false"/>
+                <w:bCs w:val="false"/>
+                <w:color w:val="1E293B"/>
+                <w:sz w:val="20"/>
+                <w:szCs w:val="20"/>
+              </w:rPr>
+              <w:t xml:space="preserve"> (1024px – 4K)</w:t>
+            </w:r>
+          </w:p>
+        </w:tc>
+        <w:tc>
+          <w:tcPr>
+            <w:tcBorders>
+              <w:top w:val="single" w:color="CBD5E1" w:sz="4"/>
+              <w:left w:val="single" w:color="CBD5E1" w:sz="4"/>
+              <w:bottom w:val="single" w:color="CBD5E1" w:sz="4"/>
+              <w:right w:val="single" w:color="CBD5E1" w:sz="4"/>
+            </w:tcBorders>
+            <w:shd w:fill="FFFFFF" w:val="clear"/>
+            <w:tcMar>
+              <w:top w:type="dxa" w:w="120"/>
+              <w:left w:type="dxa" w:w="140"/>
+              <w:bottom w:type="dxa" w:w="120"/>
+              <w:right w:type="dxa" w:w="140"/>
+            </w:tcMar>
+          </w:tcPr>
+          <w:p>
+            <w:pPr>
+              <w:spacing w:after="80" w:before="80"/>
+              <w:jc w:val="left"/>
+            </w:pPr>
+            <w:r>
+              <w:rPr>
+                <w:rFonts w:ascii="Consolas" w:cs="Consolas" w:eastAsia="Consolas" w:hAnsi="Consolas"/>
+                <w:b w:val="false"/>
+                <w:bCs w:val="false"/>
+                <w:color w:val="0F172A"/>
+                <w:sz w:val="18"/>
+                <w:szCs w:val="18"/>
+              </w:rPr>
+              <w:t xml:space="preserve"> h-5 </w:t>
+            </w:r>
+            <w:r>
+              <w:rPr>
+                <w:rFonts w:ascii="Calibri" w:cs="Calibri" w:eastAsia="Calibri" w:hAnsi="Calibri"/>
+                <w:b w:val="false"/>
+                <w:bCs w:val="false"/>
+                <w:color w:val="1E293B"/>
+                <w:sz w:val="20"/>
+                <w:szCs w:val="20"/>
+              </w:rPr>
+              <w:t xml:space="preserve"> (20px alto / 88px ancho max)</w:t>
+            </w:r>
+          </w:p>
+        </w:tc>
+        <w:tc>
+          <w:tcPr>
+            <w:tcBorders>
+              <w:top w:val="single" w:color="CBD5E1" w:sz="4"/>
+              <w:left w:val="single" w:color="CBD5E1" w:sz="4"/>
+              <w:bottom w:val="single" w:color="CBD5E1" w:sz="4"/>
+              <w:right w:val="single" w:color="CBD5E1" w:sz="4"/>
+            </w:tcBorders>
+            <w:shd w:fill="FFFFFF" w:val="clear"/>
+            <w:tcMar>
+              <w:top w:type="dxa" w:w="120"/>
+              <w:left w:type="dxa" w:w="140"/>
+              <w:bottom w:type="dxa" w:w="120"/>
+              <w:right w:type="dxa" w:w="140"/>
+            </w:tcMar>
+          </w:tcPr>
+          <w:p>
+            <w:pPr>
+              <w:spacing w:after="80" w:before="80"/>
+              <w:jc w:val="left"/>
+            </w:pPr>
+            <w:r>
+              <w:rPr>
+                <w:rFonts w:ascii="Consolas" w:cs="Consolas" w:eastAsia="Consolas" w:hAnsi="Consolas"/>
+                <w:b w:val="false"/>
+                <w:bCs w:val="false"/>
+                <w:color w:val="0F172A"/>
+                <w:sz w:val="18"/>
+                <w:szCs w:val="18"/>
+              </w:rPr>
+              <w:t xml:space="preserve"> h-16 </w:t>
+            </w:r>
+            <w:r>
+              <w:rPr>
+                <w:rFonts w:ascii="Calibri" w:cs="Calibri" w:eastAsia="Calibri" w:hAnsi="Calibri"/>
+                <w:b w:val="false"/>
+                <w:bCs w:val="false"/>
+                <w:color w:val="1E293B"/>
+                <w:sz w:val="20"/>
+                <w:szCs w:val="20"/>
+              </w:rPr>
+              <w:t xml:space="preserve"> con títulos completos</w:t>
+            </w:r>
+          </w:p>
+        </w:tc>
+        <w:tc>
+          <w:tcPr>
+            <w:tcBorders>
+              <w:top w:val="single" w:color="CBD5E1" w:sz="4"/>
+              <w:left w:val="single" w:color="CBD5E1" w:sz="4"/>
+              <w:bottom w:val="single" w:color="CBD5E1" w:sz="4"/>
+              <w:right w:val="single" w:color="CBD5E1" w:sz="4"/>
+            </w:tcBorders>
+            <w:shd w:fill="FFFFFF" w:val="clear"/>
+            <w:tcMar>
+              <w:top w:type="dxa" w:w="120"/>
+              <w:left w:type="dxa" w:w="140"/>
+              <w:bottom w:type="dxa" w:w="120"/>
+              <w:right w:type="dxa" w:w="140"/>
+            </w:tcMar>
+          </w:tcPr>
+          <w:p>
+            <w:pPr>
+              <w:spacing w:after="80" w:before="80"/>
+              <w:jc w:val="left"/>
+            </w:pPr>
+            <w:r>
+              <w:rPr>
+                <w:rFonts w:ascii="Calibri" w:cs="Calibri" w:eastAsia="Calibri" w:hAnsi="Calibri"/>
+                <w:b w:val="false"/>
+                <w:bCs w:val="false"/>
+                <w:color w:val="1E293B"/>
+                <w:sz w:val="20"/>
+                <w:szCs w:val="20"/>
+              </w:rPr>
+              <w:t xml:space="preserve">Sidebar fijo expandible + Mapas </w:t>
+            </w:r>
+            <w:r>
+              <w:rPr>
+                <w:rFonts w:ascii="Consolas" w:cs="Consolas" w:eastAsia="Consolas" w:hAnsi="Consolas"/>
+                <w:b w:val="false"/>
+                <w:bCs w:val="false"/>
+                <w:color w:val="0F172A"/>
+                <w:sz w:val="18"/>
+                <w:szCs w:val="18"/>
+              </w:rPr>
+              <w:t xml:space="preserve"> 520px </w:t>
+            </w:r>
+          </w:p>
+        </w:tc>
+      </w:tr>
+      <w:tr>
+        <w:trPr>
+          <w:cantSplit/>
+          <w:tblHeader w:val="false"/>
+        </w:trPr>
+        <w:tc>
+          <w:tcPr>
+            <w:tcBorders>
+              <w:top w:val="single" w:color="CBD5E1" w:sz="4"/>
+              <w:left w:val="single" w:color="CBD5E1" w:sz="4"/>
+              <w:bottom w:val="single" w:color="CBD5E1" w:sz="4"/>
+              <w:right w:val="single" w:color="CBD5E1" w:sz="4"/>
+            </w:tcBorders>
+            <w:shd w:fill="F8FAFC" w:val="clear"/>
+            <w:tcMar>
+              <w:top w:type="dxa" w:w="120"/>
+              <w:left w:type="dxa" w:w="140"/>
+              <w:bottom w:type="dxa" w:w="120"/>
+              <w:right w:type="dxa" w:w="140"/>
+            </w:tcMar>
+          </w:tcPr>
+          <w:p>
+            <w:pPr>
+              <w:spacing w:after="80" w:before="80"/>
+              <w:jc w:val="left"/>
+            </w:pPr>
+            <w:r>
+              <w:rPr>
+                <w:rFonts w:ascii="Calibri" w:cs="Calibri" w:eastAsia="Calibri" w:hAnsi="Calibri"/>
+                <w:b/>
+                <w:bCs/>
+                <w:color w:val="002B49"/>
+                <w:sz w:val="20"/>
+                <w:szCs w:val="20"/>
+              </w:rPr>
+              <w:t xml:space="preserve">Tablets</w:t>
+            </w:r>
+          </w:p>
+        </w:tc>
+        <w:tc>
+          <w:tcPr>
+            <w:tcBorders>
+              <w:top w:val="single" w:color="CBD5E1" w:sz="4"/>
+              <w:left w:val="single" w:color="CBD5E1" w:sz="4"/>
+              <w:bottom w:val="single" w:color="CBD5E1" w:sz="4"/>
+              <w:right w:val="single" w:color="CBD5E1" w:sz="4"/>
+            </w:tcBorders>
+            <w:shd w:fill="F8FAFC" w:val="clear"/>
+            <w:tcMar>
+              <w:top w:type="dxa" w:w="120"/>
+              <w:left w:type="dxa" w:w="140"/>
+              <w:bottom w:type="dxa" w:w="120"/>
+              <w:right w:type="dxa" w:w="140"/>
+            </w:tcMar>
+          </w:tcPr>
+          <w:p>
+            <w:pPr>
+              <w:spacing w:after="80" w:before="80"/>
+              <w:jc w:val="left"/>
+            </w:pPr>
+            <w:r>
+              <w:rPr>
+                <w:rFonts w:ascii="Consolas" w:cs="Consolas" w:eastAsia="Consolas" w:hAnsi="Consolas"/>
+                <w:b w:val="false"/>
+                <w:bCs w:val="false"/>
+                <w:color w:val="0F172A"/>
+                <w:sz w:val="18"/>
+                <w:szCs w:val="18"/>
+              </w:rPr>
+              <w:t xml:space="preserve"> sm: </w:t>
+            </w:r>
+            <w:r>
+              <w:rPr>
+                <w:rFonts w:ascii="Calibri" w:cs="Calibri" w:eastAsia="Calibri" w:hAnsi="Calibri"/>
+                <w:b w:val="false"/>
+                <w:bCs w:val="false"/>
+                <w:color w:val="1E293B"/>
+                <w:sz w:val="20"/>
+                <w:szCs w:val="20"/>
+              </w:rPr>
+              <w:t xml:space="preserve"> a </w:t>
+            </w:r>
+            <w:r>
+              <w:rPr>
+                <w:rFonts w:ascii="Consolas" w:cs="Consolas" w:eastAsia="Consolas" w:hAnsi="Consolas"/>
+                <w:b w:val="false"/>
+                <w:bCs w:val="false"/>
+                <w:color w:val="0F172A"/>
+                <w:sz w:val="18"/>
+                <w:szCs w:val="18"/>
+              </w:rPr>
+              <w:t xml:space="preserve"> md: </w:t>
+            </w:r>
+            <w:r>
+              <w:rPr>
+                <w:rFonts w:ascii="Calibri" w:cs="Calibri" w:eastAsia="Calibri" w:hAnsi="Calibri"/>
+                <w:b w:val="false"/>
+                <w:bCs w:val="false"/>
+                <w:color w:val="1E293B"/>
+                <w:sz w:val="20"/>
+                <w:szCs w:val="20"/>
+              </w:rPr>
+              <w:t xml:space="preserve"> (640px – 1023px)</w:t>
+            </w:r>
+          </w:p>
+        </w:tc>
+        <w:tc>
+          <w:tcPr>
+            <w:tcBorders>
+              <w:top w:val="single" w:color="CBD5E1" w:sz="4"/>
+              <w:left w:val="single" w:color="CBD5E1" w:sz="4"/>
+              <w:bottom w:val="single" w:color="CBD5E1" w:sz="4"/>
+              <w:right w:val="single" w:color="CBD5E1" w:sz="4"/>
+            </w:tcBorders>
+            <w:shd w:fill="F8FAFC" w:val="clear"/>
+            <w:tcMar>
+              <w:top w:type="dxa" w:w="120"/>
+              <w:left w:type="dxa" w:w="140"/>
+              <w:bottom w:type="dxa" w:w="120"/>
+              <w:right w:type="dxa" w:w="140"/>
+            </w:tcMar>
+          </w:tcPr>
+          <w:p>
+            <w:pPr>
+              <w:spacing w:after="80" w:before="80"/>
+              <w:jc w:val="left"/>
+            </w:pPr>
+            <w:r>
+              <w:rPr>
+                <w:rFonts w:ascii="Consolas" w:cs="Consolas" w:eastAsia="Consolas" w:hAnsi="Consolas"/>
+                <w:b w:val="false"/>
+                <w:bCs w:val="false"/>
+                <w:color w:val="0F172A"/>
+                <w:sz w:val="18"/>
+                <w:szCs w:val="18"/>
+              </w:rPr>
+              <w:t xml:space="preserve"> h-4 </w:t>
+            </w:r>
+            <w:r>
+              <w:rPr>
+                <w:rFonts w:ascii="Calibri" w:cs="Calibri" w:eastAsia="Calibri" w:hAnsi="Calibri"/>
+                <w:b w:val="false"/>
+                <w:bCs w:val="false"/>
+                <w:color w:val="1E293B"/>
+                <w:sz w:val="20"/>
+                <w:szCs w:val="20"/>
+              </w:rPr>
+              <w:t xml:space="preserve"> (16px alto / 70px ancho max)</w:t>
+            </w:r>
+          </w:p>
+        </w:tc>
+        <w:tc>
+          <w:tcPr>
+            <w:tcBorders>
+              <w:top w:val="single" w:color="CBD5E1" w:sz="4"/>
+              <w:left w:val="single" w:color="CBD5E1" w:sz="4"/>
+              <w:bottom w:val="single" w:color="CBD5E1" w:sz="4"/>
+              <w:right w:val="single" w:color="CBD5E1" w:sz="4"/>
+            </w:tcBorders>
+            <w:shd w:fill="F8FAFC" w:val="clear"/>
+            <w:tcMar>
+              <w:top w:type="dxa" w:w="120"/>
+              <w:left w:type="dxa" w:w="140"/>
+              <w:bottom w:type="dxa" w:w="120"/>
+              <w:right w:type="dxa" w:w="140"/>
+            </w:tcMar>
+          </w:tcPr>
+          <w:p>
+            <w:pPr>
+              <w:spacing w:after="80" w:before="80"/>
+              <w:jc w:val="left"/>
+            </w:pPr>
+            <w:r>
+              <w:rPr>
+                <w:rFonts w:ascii="Consolas" w:cs="Consolas" w:eastAsia="Consolas" w:hAnsi="Consolas"/>
+                <w:b w:val="false"/>
+                <w:bCs w:val="false"/>
+                <w:color w:val="0F172A"/>
+                <w:sz w:val="18"/>
+                <w:szCs w:val="18"/>
+              </w:rPr>
+              <w:t xml:space="preserve"> h-14 </w:t>
+            </w:r>
+            <w:r>
+              <w:rPr>
+                <w:rFonts w:ascii="Calibri" w:cs="Calibri" w:eastAsia="Calibri" w:hAnsi="Calibri"/>
+                <w:b w:val="false"/>
+                <w:bCs w:val="false"/>
+                <w:color w:val="1E293B"/>
+                <w:sz w:val="20"/>
+                <w:szCs w:val="20"/>
+              </w:rPr>
+              <w:t xml:space="preserve"> con título abreviado</w:t>
+            </w:r>
+          </w:p>
+        </w:tc>
+        <w:tc>
+          <w:tcPr>
+            <w:tcBorders>
+              <w:top w:val="single" w:color="CBD5E1" w:sz="4"/>
+              <w:left w:val="single" w:color="CBD5E1" w:sz="4"/>
+              <w:bottom w:val="single" w:color="CBD5E1" w:sz="4"/>
+              <w:right w:val="single" w:color="CBD5E1" w:sz="4"/>
+            </w:tcBorders>
+            <w:shd w:fill="F8FAFC" w:val="clear"/>
+            <w:tcMar>
+              <w:top w:type="dxa" w:w="120"/>
+              <w:left w:type="dxa" w:w="140"/>
+              <w:bottom w:type="dxa" w:w="120"/>
+              <w:right w:type="dxa" w:w="140"/>
+            </w:tcMar>
+          </w:tcPr>
+          <w:p>
+            <w:pPr>
+              <w:spacing w:after="80" w:before="80"/>
+              <w:jc w:val="left"/>
+            </w:pPr>
+            <w:r>
+              <w:rPr>
+                <w:rFonts w:ascii="Calibri" w:cs="Calibri" w:eastAsia="Calibri" w:hAnsi="Calibri"/>
+                <w:b w:val="false"/>
+                <w:bCs w:val="false"/>
+                <w:color w:val="1E293B"/>
+                <w:sz w:val="20"/>
+                <w:szCs w:val="20"/>
+              </w:rPr>
+              <w:t xml:space="preserve">Sidebar colapsable + Mapas </w:t>
+            </w:r>
+            <w:r>
+              <w:rPr>
+                <w:rFonts w:ascii="Consolas" w:cs="Consolas" w:eastAsia="Consolas" w:hAnsi="Consolas"/>
+                <w:b w:val="false"/>
+                <w:bCs w:val="false"/>
+                <w:color w:val="0F172A"/>
+                <w:sz w:val="18"/>
+                <w:szCs w:val="18"/>
+              </w:rPr>
+              <w:t xml:space="preserve"> 460px </w:t>
+            </w:r>
+          </w:p>
+        </w:tc>
+      </w:tr>
+      <w:tr>
+        <w:trPr>
+          <w:cantSplit/>
+          <w:tblHeader w:val="false"/>
+        </w:trPr>
+        <w:tc>
+          <w:tcPr>
+            <w:tcBorders>
+              <w:top w:val="single" w:color="CBD5E1" w:sz="4"/>
+              <w:left w:val="single" w:color="CBD5E1" w:sz="4"/>
+              <w:bottom w:val="single" w:color="CBD5E1" w:sz="4"/>
+              <w:right w:val="single" w:color="CBD5E1" w:sz="4"/>
+            </w:tcBorders>
+            <w:shd w:fill="FFFFFF" w:val="clear"/>
+            <w:tcMar>
+              <w:top w:type="dxa" w:w="120"/>
+              <w:left w:type="dxa" w:w="140"/>
+              <w:bottom w:type="dxa" w:w="120"/>
+              <w:right w:type="dxa" w:w="140"/>
+            </w:tcMar>
+          </w:tcPr>
+          <w:p>
+            <w:pPr>
+              <w:spacing w:after="80" w:before="80"/>
+              <w:jc w:val="left"/>
+            </w:pPr>
+            <w:r>
+              <w:rPr>
+                <w:rFonts w:ascii="Calibri" w:cs="Calibri" w:eastAsia="Calibri" w:hAnsi="Calibri"/>
+                <w:b/>
+                <w:bCs/>
+                <w:color w:val="002B49"/>
+                <w:sz w:val="20"/>
+                <w:szCs w:val="20"/>
+              </w:rPr>
+              <w:t xml:space="preserve">Smartphones Móviles</w:t>
+            </w:r>
+          </w:p>
+        </w:tc>
+        <w:tc>
+          <w:tcPr>
+            <w:tcBorders>
+              <w:top w:val="single" w:color="CBD5E1" w:sz="4"/>
+              <w:left w:val="single" w:color="CBD5E1" w:sz="4"/>
+              <w:bottom w:val="single" w:color="CBD5E1" w:sz="4"/>
+              <w:right w:val="single" w:color="CBD5E1" w:sz="4"/>
+            </w:tcBorders>
+            <w:shd w:fill="FFFFFF" w:val="clear"/>
+            <w:tcMar>
+              <w:top w:type="dxa" w:w="120"/>
+              <w:left w:type="dxa" w:w="140"/>
+              <w:bottom w:type="dxa" w:w="120"/>
+              <w:right w:type="dxa" w:w="140"/>
+            </w:tcMar>
+          </w:tcPr>
+          <w:p>
+            <w:pPr>
+              <w:spacing w:after="80" w:before="80"/>
+              <w:jc w:val="left"/>
+            </w:pPr>
+            <w:r>
+              <w:rPr>
+                <w:rFonts w:ascii="Consolas" w:cs="Consolas" w:eastAsia="Consolas" w:hAnsi="Consolas"/>
+                <w:b w:val="false"/>
+                <w:bCs w:val="false"/>
+                <w:color w:val="0F172A"/>
+                <w:sz w:val="18"/>
+                <w:szCs w:val="18"/>
+              </w:rPr>
+              <w:t xml:space="preserve"> &lt;sm </w:t>
+            </w:r>
+            <w:r>
+              <w:rPr>
+                <w:rFonts w:ascii="Calibri" w:cs="Calibri" w:eastAsia="Calibri" w:hAnsi="Calibri"/>
+                <w:b w:val="false"/>
+                <w:bCs w:val="false"/>
+                <w:color w:val="1E293B"/>
+                <w:sz w:val="20"/>
+                <w:szCs w:val="20"/>
+              </w:rPr>
+              <w:t xml:space="preserve"> (320px – 639px)</w:t>
+            </w:r>
+          </w:p>
+        </w:tc>
+        <w:tc>
+          <w:tcPr>
+            <w:tcBorders>
+              <w:top w:val="single" w:color="CBD5E1" w:sz="4"/>
+              <w:left w:val="single" w:color="CBD5E1" w:sz="4"/>
+              <w:bottom w:val="single" w:color="CBD5E1" w:sz="4"/>
+              <w:right w:val="single" w:color="CBD5E1" w:sz="4"/>
+            </w:tcBorders>
+            <w:shd w:fill="FFFFFF" w:val="clear"/>
+            <w:tcMar>
+              <w:top w:type="dxa" w:w="120"/>
+              <w:left w:type="dxa" w:w="140"/>
+              <w:bottom w:type="dxa" w:w="120"/>
+              <w:right w:type="dxa" w:w="140"/>
+            </w:tcMar>
+          </w:tcPr>
+          <w:p>
+            <w:pPr>
+              <w:spacing w:after="80" w:before="80"/>
+              <w:jc w:val="left"/>
+            </w:pPr>
+            <w:r>
+              <w:rPr>
+                <w:rFonts w:ascii="Consolas" w:cs="Consolas" w:eastAsia="Consolas" w:hAnsi="Consolas"/>
+                <w:b w:val="false"/>
+                <w:bCs w:val="false"/>
+                <w:color w:val="0F172A"/>
+                <w:sz w:val="18"/>
+                <w:szCs w:val="18"/>
+              </w:rPr>
+              <w:t xml:space="preserve"> h-3.5 </w:t>
+            </w:r>
+            <w:r>
+              <w:rPr>
+                <w:rFonts w:ascii="Calibri" w:cs="Calibri" w:eastAsia="Calibri" w:hAnsi="Calibri"/>
+                <w:b w:val="false"/>
+                <w:bCs w:val="false"/>
+                <w:color w:val="1E293B"/>
+                <w:sz w:val="20"/>
+                <w:szCs w:val="20"/>
+              </w:rPr>
+              <w:t xml:space="preserve"> (14px alto / 50px ancho max)</w:t>
+            </w:r>
+          </w:p>
+        </w:tc>
+        <w:tc>
+          <w:tcPr>
+            <w:tcBorders>
+              <w:top w:val="single" w:color="CBD5E1" w:sz="4"/>
+              <w:left w:val="single" w:color="CBD5E1" w:sz="4"/>
+              <w:bottom w:val="single" w:color="CBD5E1" w:sz="4"/>
+              <w:right w:val="single" w:color="CBD5E1" w:sz="4"/>
+            </w:tcBorders>
+            <w:shd w:fill="FFFFFF" w:val="clear"/>
+            <w:tcMar>
+              <w:top w:type="dxa" w:w="120"/>
+              <w:left w:type="dxa" w:w="140"/>
+              <w:bottom w:type="dxa" w:w="120"/>
+              <w:right w:type="dxa" w:w="140"/>
+            </w:tcMar>
+          </w:tcPr>
+          <w:p>
+            <w:pPr>
+              <w:spacing w:after="80" w:before="80"/>
+              <w:jc w:val="left"/>
+            </w:pPr>
+            <w:r>
+              <w:rPr>
+                <w:rFonts w:ascii="Consolas" w:cs="Consolas" w:eastAsia="Consolas" w:hAnsi="Consolas"/>
+                <w:b w:val="false"/>
+                <w:bCs w:val="false"/>
+                <w:color w:val="0F172A"/>
+                <w:sz w:val="18"/>
+                <w:szCs w:val="18"/>
+              </w:rPr>
+              <w:t xml:space="preserve"> h-12 </w:t>
+            </w:r>
+            <w:r>
+              <w:rPr>
+                <w:rFonts w:ascii="Calibri" w:cs="Calibri" w:eastAsia="Calibri" w:hAnsi="Calibri"/>
+                <w:b w:val="false"/>
+                <w:bCs w:val="false"/>
+                <w:color w:val="1E293B"/>
+                <w:sz w:val="20"/>
+                <w:szCs w:val="20"/>
+              </w:rPr>
+              <w:t xml:space="preserve"> con SIGI/GGPD badges</w:t>
+            </w:r>
+          </w:p>
+        </w:tc>
+        <w:tc>
+          <w:tcPr>
+            <w:tcBorders>
+              <w:top w:val="single" w:color="CBD5E1" w:sz="4"/>
+              <w:left w:val="single" w:color="CBD5E1" w:sz="4"/>
+              <w:bottom w:val="single" w:color="CBD5E1" w:sz="4"/>
+              <w:right w:val="single" w:color="CBD5E1" w:sz="4"/>
+            </w:tcBorders>
+            <w:shd w:fill="FFFFFF" w:val="clear"/>
+            <w:tcMar>
+              <w:top w:type="dxa" w:w="120"/>
+              <w:left w:type="dxa" w:w="140"/>
+              <w:bottom w:type="dxa" w:w="120"/>
+              <w:right w:type="dxa" w:w="140"/>
+            </w:tcMar>
+          </w:tcPr>
+          <w:p>
+            <w:pPr>
+              <w:spacing w:after="80" w:before="80"/>
+              <w:jc w:val="left"/>
+            </w:pPr>
+            <w:r>
+              <w:rPr>
+                <w:rFonts w:ascii="Calibri" w:cs="Calibri" w:eastAsia="Calibri" w:hAnsi="Calibri"/>
+                <w:b w:val="false"/>
+                <w:bCs w:val="false"/>
+                <w:color w:val="1E293B"/>
+                <w:sz w:val="20"/>
+                <w:szCs w:val="20"/>
+              </w:rPr>
+              <w:t xml:space="preserve">Drawer lateral táctil + Bottom Nav fija (</w:t>
+            </w:r>
+            <w:r>
+              <w:rPr>
+                <w:rFonts w:ascii="Consolas" w:cs="Consolas" w:eastAsia="Consolas" w:hAnsi="Consolas"/>
+                <w:b w:val="false"/>
+                <w:bCs w:val="false"/>
+                <w:color w:val="0F172A"/>
+                <w:sz w:val="18"/>
+                <w:szCs w:val="18"/>
+              </w:rPr>
+              <w:t xml:space="preserve"> pb-safe </w:t>
+            </w:r>
+            <w:r>
+              <w:rPr>
+                <w:rFonts w:ascii="Calibri" w:cs="Calibri" w:eastAsia="Calibri" w:hAnsi="Calibri"/>
+                <w:b w:val="false"/>
+                <w:bCs w:val="false"/>
+                <w:color w:val="1E293B"/>
+                <w:sz w:val="20"/>
+                <w:szCs w:val="20"/>
+              </w:rPr>
+              <w:t xml:space="preserve">) + Mapas </w:t>
+            </w:r>
+            <w:r>
+              <w:rPr>
+                <w:rFonts w:ascii="Consolas" w:cs="Consolas" w:eastAsia="Consolas" w:hAnsi="Consolas"/>
+                <w:b w:val="false"/>
+                <w:bCs w:val="false"/>
+                <w:color w:val="0F172A"/>
+                <w:sz w:val="18"/>
+                <w:szCs w:val="18"/>
+              </w:rPr>
+              <w:t xml:space="preserve"> 360px </w:t>
+            </w:r>
+          </w:p>
+        </w:tc>
+      </w:tr>
+    </w:tbl>
+    <w:p>
+      <w:pPr>
+        <w:spacing w:after="180"/>
+      </w:pPr>
+    </w:p>
+    <w:p>
+      <w:pPr>
+        <w:pStyle w:val="Heading3"/>
+        <w:spacing w:after="80" w:before="160"/>
+      </w:pPr>
+      <w:r>
+        <w:rPr>
+          <w:rFonts w:ascii="Calibri" w:cs="Calibri" w:eastAsia="Calibri" w:hAnsi="Calibri"/>
+          <w:b/>
+          <w:bCs/>
+          <w:color w:val="1E293B"/>
+          <w:sz w:val="22"/>
+          <w:szCs w:val="22"/>
+        </w:rPr>
+        <w:t xml:space="preserve">Principios de Adaptabilidad Implementados:</w:t>
+      </w:r>
+    </w:p>
+    <w:p>
+      <w:pPr>
+        <w:spacing w:after="80" w:before="60"/>
+      </w:pPr>
+      <w:r>
+        <w:rPr>
+          <w:rFonts w:ascii="Calibri" w:cs="Calibri" w:eastAsia="Calibri" w:hAnsi="Calibri"/>
+          <w:b w:val="false"/>
+          <w:bCs w:val="false"/>
+          <w:color w:val="1E293B"/>
+          <w:sz w:val="20"/>
+          <w:szCs w:val="20"/>
+        </w:rPr>
+        <w:t xml:space="preserve">1. </w:t>
+      </w:r>
+      <w:r>
+        <w:rPr>
+          <w:rFonts w:ascii="Calibri" w:cs="Calibri" w:eastAsia="Calibri" w:hAnsi="Calibri"/>
+          <w:b/>
+          <w:bCs/>
+          <w:color w:val="002B49"/>
+          <w:sz w:val="20"/>
+          <w:szCs w:val="20"/>
+        </w:rPr>
+        <w:t xml:space="preserve">Anclaje Inflexible de Controles (`shrink-0`):</w:t>
+      </w:r>
+      <w:r>
+        <w:rPr>
+          <w:rFonts w:ascii="Calibri" w:cs="Calibri" w:eastAsia="Calibri" w:hAnsi="Calibri"/>
+          <w:b w:val="false"/>
+          <w:bCs w:val="false"/>
+          <w:color w:val="1E293B"/>
+          <w:sz w:val="20"/>
+          <w:szCs w:val="20"/>
+        </w:rPr>
+        <w:t xml:space="preserve"> Los botones de inicio de sesión, conmutador de tema y badges permanecen protegidos contra desbordamientos horizontales.</w:t>
+      </w:r>
+    </w:p>
+    <w:p>
+      <w:pPr>
+        <w:spacing w:after="80" w:before="60"/>
+      </w:pPr>
+      <w:r>
+        <w:rPr>
+          <w:rFonts w:ascii="Calibri" w:cs="Calibri" w:eastAsia="Calibri" w:hAnsi="Calibri"/>
+          <w:b w:val="false"/>
+          <w:bCs w:val="false"/>
+          <w:color w:val="1E293B"/>
+          <w:sz w:val="20"/>
+          <w:szCs w:val="20"/>
+        </w:rPr>
+        <w:t xml:space="preserve">2. </w:t>
+      </w:r>
+      <w:r>
+        <w:rPr>
+          <w:rFonts w:ascii="Calibri" w:cs="Calibri" w:eastAsia="Calibri" w:hAnsi="Calibri"/>
+          <w:b/>
+          <w:bCs/>
+          <w:color w:val="002B49"/>
+          <w:sz w:val="20"/>
+          <w:szCs w:val="20"/>
+        </w:rPr>
+        <w:t xml:space="preserve">Safe-Area Insets para Móviles:</w:t>
+      </w:r>
+      <w:r>
+        <w:rPr>
+          <w:rFonts w:ascii="Calibri" w:cs="Calibri" w:eastAsia="Calibri" w:hAnsi="Calibri"/>
+          <w:b w:val="false"/>
+          <w:bCs w:val="false"/>
+          <w:color w:val="1E293B"/>
+          <w:sz w:val="20"/>
+          <w:szCs w:val="20"/>
+        </w:rPr>
+        <w:t xml:space="preserve"> Soporte nativo para notch y barras de navegación por gestos en iOS y Android (</w:t>
+      </w:r>
+      <w:r>
+        <w:rPr>
+          <w:rFonts w:ascii="Consolas" w:cs="Consolas" w:eastAsia="Consolas" w:hAnsi="Consolas"/>
+          <w:b w:val="false"/>
+          <w:bCs w:val="false"/>
+          <w:color w:val="0F172A"/>
+          <w:sz w:val="18"/>
+          <w:szCs w:val="18"/>
+        </w:rPr>
+        <w:t xml:space="preserve"> viewport-fit=cover </w:t>
+      </w:r>
+      <w:r>
+        <w:rPr>
+          <w:rFonts w:ascii="Calibri" w:cs="Calibri" w:eastAsia="Calibri" w:hAnsi="Calibri"/>
+          <w:b w:val="false"/>
+          <w:bCs w:val="false"/>
+          <w:color w:val="1E293B"/>
+          <w:sz w:val="20"/>
+          <w:szCs w:val="20"/>
+        </w:rPr>
+        <w:t xml:space="preserve">).</w:t>
+      </w:r>
+    </w:p>
+    <w:p>
+      <w:pPr>
+        <w:spacing w:after="80" w:before="60"/>
+      </w:pPr>
+      <w:r>
+        <w:rPr>
+          <w:rFonts w:ascii="Calibri" w:cs="Calibri" w:eastAsia="Calibri" w:hAnsi="Calibri"/>
+          <w:b w:val="false"/>
+          <w:bCs w:val="false"/>
+          <w:color w:val="1E293B"/>
+          <w:sz w:val="20"/>
+          <w:szCs w:val="20"/>
+        </w:rPr>
+        <w:t xml:space="preserve">3. </w:t>
+      </w:r>
+      <w:r>
+        <w:rPr>
+          <w:rFonts w:ascii="Calibri" w:cs="Calibri" w:eastAsia="Calibri" w:hAnsi="Calibri"/>
+          <w:b/>
+          <w:bCs/>
+          <w:color w:val="002B49"/>
+          <w:sz w:val="20"/>
+          <w:szCs w:val="20"/>
+        </w:rPr>
+        <w:t xml:space="preserve">Mapas GIS Fluidos:</w:t>
+      </w:r>
+      <w:r>
+        <w:rPr>
+          <w:rFonts w:ascii="Calibri" w:cs="Calibri" w:eastAsia="Calibri" w:hAnsi="Calibri"/>
+          <w:b w:val="false"/>
+          <w:bCs w:val="false"/>
+          <w:color w:val="1E293B"/>
+          <w:sz w:val="20"/>
+          <w:szCs w:val="20"/>
+        </w:rPr>
+        <w:t xml:space="preserve"> Los lienzos Leaflet de Subestaciones y Circuitos escalan su altura vertical para permitir desplazamiento natural por la pantalla del celular sin bloquear el scroll del usuario.</w:t>
       </w:r>
     </w:p>
     <w:sectPr>

</xml_diff>

<commit_message>
feat(sigi): implementar asistente wizard ISO 8000, motor heuristico de auditoria, catalogos maestros MDM y documentacion GGPD-SGM-INS-006
</commit_message>
<xml_diff>
--- a/apps/corpoelec-sigi-gestion-planificacion-distribucion/docs/NAC_2026_GGPD_MANUAL_SISTEMA_ARQUITECTURA_SIGI_V01.docx
+++ b/apps/corpoelec-sigi-gestion-planificacion-distribucion/docs/NAC_2026_GGPD_MANUAL_SISTEMA_ARQUITECTURA_SIGI_V01.docx
@@ -4613,6 +4613,432 @@
           <w:szCs w:val="20"/>
         </w:rPr>
         <w:t xml:space="preserve"> Los lienzos Leaflet de Subestaciones y Circuitos escalan su altura vertical para permitir desplazamiento natural por la pantalla del celular sin bloquear el scroll del usuario.</w:t>
+      </w:r>
+    </w:p>
+    <w:p>
+      <w:pPr>
+        <w:pBdr>
+          <w:bottom w:val="single" w:color="CBD5E1" w:sz="6" w:space="1"/>
+        </w:pBdr>
+        <w:spacing w:after="120" w:before="120"/>
+      </w:pPr>
+    </w:p>
+    <w:p>
+      <w:pPr>
+        <w:pStyle w:val="Heading2"/>
+        <w:spacing w:after="100" w:before="200"/>
+      </w:pPr>
+      <w:r>
+        <w:rPr>
+          <w:rFonts w:ascii="Calibri" w:cs="Calibri" w:eastAsia="Calibri" w:hAnsi="Calibri"/>
+          <w:b/>
+          <w:bCs/>
+          <w:color w:val="004488"/>
+          <w:sz w:val="26"/>
+          <w:szCs w:val="26"/>
+        </w:rPr>
+        <w:t xml:space="preserve">🧙‍♂️ 9. MÓDULO DE INGESTA INTELIGENTE, ASISTENTE WIZARD ISO 8000 &amp; CATÁLOGOS MAESTROS (MDM)</w:t>
+      </w:r>
+    </w:p>
+    <w:p>
+      <w:pPr>
+        <w:spacing w:after="80" w:before="60"/>
+      </w:pPr>
+      <w:r>
+        <w:rPr>
+          <w:rFonts w:ascii="Calibri" w:cs="Calibri" w:eastAsia="Calibri" w:hAnsi="Calibri"/>
+          <w:b w:val="false"/>
+          <w:bCs w:val="false"/>
+          <w:color w:val="1E293B"/>
+          <w:sz w:val="20"/>
+          <w:szCs w:val="20"/>
+        </w:rPr>
+        <w:t xml:space="preserve">El SIGI incorpora el ecosistema integral de carga de datos sin necesidad de acceder individualmente a las 4 aplicaciones satélites:</w:t>
+      </w:r>
+    </w:p>
+    <w:p>
+      <w:pPr>
+        <w:spacing w:after="80" w:before="60"/>
+      </w:pPr>
+      <w:r>
+        <w:rPr>
+          <w:rFonts w:ascii="Calibri" w:cs="Calibri" w:eastAsia="Calibri" w:hAnsi="Calibri"/>
+          <w:b w:val="false"/>
+          <w:bCs w:val="false"/>
+          <w:color w:val="1E293B"/>
+          <w:sz w:val="20"/>
+          <w:szCs w:val="20"/>
+        </w:rPr>
+        <w:t xml:space="preserve">1. </w:t>
+      </w:r>
+      <w:r>
+        <w:rPr>
+          <w:rFonts w:ascii="Calibri" w:cs="Calibri" w:eastAsia="Calibri" w:hAnsi="Calibri"/>
+          <w:b/>
+          <w:bCs/>
+          <w:color w:val="002B49"/>
+          <w:sz w:val="20"/>
+          <w:szCs w:val="20"/>
+        </w:rPr>
+        <w:t xml:space="preserve">Aduana de Doble Control:</w:t>
+      </w:r>
+    </w:p>
+    <w:p>
+      <w:pPr>
+        <w:pStyle w:val="ListParagraph"/>
+        <w:numPr>
+          <w:ilvl w:val="0"/>
+          <w:numId w:val="1"/>
+        </w:numPr>
+        <w:spacing w:after="40" w:before="40"/>
+      </w:pPr>
+      <w:r>
+        <w:rPr>
+          <w:rFonts w:ascii="Calibri" w:cs="Calibri" w:eastAsia="Calibri" w:hAnsi="Calibri"/>
+          <w:b/>
+          <w:bCs/>
+          <w:color w:val="002B49"/>
+          <w:sz w:val="20"/>
+          <w:szCs w:val="20"/>
+        </w:rPr>
+        <w:t xml:space="preserve">Aduana 1 (Pre-Ingesta / Wizard):</w:t>
+      </w:r>
+      <w:r>
+        <w:rPr>
+          <w:rFonts w:ascii="Calibri" w:cs="Calibri" w:eastAsia="Calibri" w:hAnsi="Calibri"/>
+          <w:b w:val="false"/>
+          <w:bCs w:val="false"/>
+          <w:color w:val="1E293B"/>
+          <w:sz w:val="20"/>
+          <w:szCs w:val="20"/>
+        </w:rPr>
+        <w:t xml:space="preserve"> Asistente de diseño y auditoría heurística que detecta antipatrones relacionales (1NF / 3NF) y calcula el índice de madurez (0-100%).</w:t>
+      </w:r>
+    </w:p>
+    <w:p>
+      <w:pPr>
+        <w:pStyle w:val="ListParagraph"/>
+        <w:numPr>
+          <w:ilvl w:val="0"/>
+          <w:numId w:val="1"/>
+        </w:numPr>
+        <w:spacing w:after="40" w:before="40"/>
+      </w:pPr>
+      <w:r>
+        <w:rPr>
+          <w:rFonts w:ascii="Calibri" w:cs="Calibri" w:eastAsia="Calibri" w:hAnsi="Calibri"/>
+          <w:b/>
+          <w:bCs/>
+          <w:color w:val="002B49"/>
+          <w:sz w:val="20"/>
+          <w:szCs w:val="20"/>
+        </w:rPr>
+        <w:t xml:space="preserve">Aduana 2 (Operativa Semanal):</w:t>
+      </w:r>
+      <w:r>
+        <w:rPr>
+          <w:rFonts w:ascii="Calibri" w:cs="Calibri" w:eastAsia="Calibri" w:hAnsi="Calibri"/>
+          <w:b w:val="false"/>
+          <w:bCs w:val="false"/>
+          <w:color w:val="1E293B"/>
+          <w:sz w:val="20"/>
+          <w:szCs w:val="20"/>
+        </w:rPr>
+        <w:t xml:space="preserve"> Validador en caliente de nomenclatura y contenido fila por fila con cálculo de índice OTQR (%) y generación de planillas de remediación </w:t>
+      </w:r>
+      <w:r>
+        <w:rPr>
+          <w:rFonts w:ascii="Consolas" w:cs="Consolas" w:eastAsia="Consolas" w:hAnsi="Consolas"/>
+          <w:b w:val="false"/>
+          <w:bCs w:val="false"/>
+          <w:color w:val="0F172A"/>
+          <w:sz w:val="18"/>
+          <w:szCs w:val="18"/>
+        </w:rPr>
+        <w:t xml:space="preserve"> .xlsx </w:t>
+      </w:r>
+      <w:r>
+        <w:rPr>
+          <w:rFonts w:ascii="Calibri" w:cs="Calibri" w:eastAsia="Calibri" w:hAnsi="Calibri"/>
+          <w:b w:val="false"/>
+          <w:bCs w:val="false"/>
+          <w:color w:val="1E293B"/>
+          <w:sz w:val="20"/>
+          <w:szCs w:val="20"/>
+        </w:rPr>
+        <w:t xml:space="preserve"> con tareas en SCMTP (SLA 48h).</w:t>
+      </w:r>
+    </w:p>
+    <w:p>
+      <w:pPr>
+        <w:spacing w:after="80" w:before="60"/>
+      </w:pPr>
+      <w:r>
+        <w:rPr>
+          <w:rFonts w:ascii="Calibri" w:cs="Calibri" w:eastAsia="Calibri" w:hAnsi="Calibri"/>
+          <w:b w:val="false"/>
+          <w:bCs w:val="false"/>
+          <w:color w:val="1E293B"/>
+          <w:sz w:val="20"/>
+          <w:szCs w:val="20"/>
+        </w:rPr>
+        <w:t xml:space="preserve">2. </w:t>
+      </w:r>
+      <w:r>
+        <w:rPr>
+          <w:rFonts w:ascii="Calibri" w:cs="Calibri" w:eastAsia="Calibri" w:hAnsi="Calibri"/>
+          <w:b/>
+          <w:bCs/>
+          <w:color w:val="002B49"/>
+          <w:sz w:val="20"/>
+          <w:szCs w:val="20"/>
+        </w:rPr>
+        <w:t xml:space="preserve">Repositorio de Catálogos Maestros (MDM Registry):</w:t>
+      </w:r>
+    </w:p>
+    <w:p>
+      <w:pPr>
+        <w:pStyle w:val="ListParagraph"/>
+        <w:numPr>
+          <w:ilvl w:val="0"/>
+          <w:numId w:val="1"/>
+        </w:numPr>
+        <w:spacing w:after="40" w:before="40"/>
+      </w:pPr>
+      <w:r>
+        <w:rPr>
+          <w:rFonts w:ascii="Calibri" w:cs="Calibri" w:eastAsia="Calibri" w:hAnsi="Calibri"/>
+          <w:b w:val="false"/>
+          <w:bCs w:val="false"/>
+          <w:color w:val="1E293B"/>
+          <w:sz w:val="20"/>
+          <w:szCs w:val="20"/>
+        </w:rPr>
+        <w:t xml:space="preserve">Listas compartidas del SEN (</w:t>
+      </w:r>
+      <w:r>
+        <w:rPr>
+          <w:rFonts w:ascii="Consolas" w:cs="Consolas" w:eastAsia="Consolas" w:hAnsi="Consolas"/>
+          <w:b w:val="false"/>
+          <w:bCs w:val="false"/>
+          <w:color w:val="0F172A"/>
+          <w:sz w:val="18"/>
+          <w:szCs w:val="18"/>
+        </w:rPr>
+        <w:t xml:space="preserve"> CAT_SUBESTACIONES_SEN </w:t>
+      </w:r>
+      <w:r>
+        <w:rPr>
+          <w:rFonts w:ascii="Calibri" w:cs="Calibri" w:eastAsia="Calibri" w:hAnsi="Calibri"/>
+          <w:b w:val="false"/>
+          <w:bCs w:val="false"/>
+          <w:color w:val="1E293B"/>
+          <w:sz w:val="20"/>
+          <w:szCs w:val="20"/>
+        </w:rPr>
+        <w:t xml:space="preserve">, </w:t>
+      </w:r>
+      <w:r>
+        <w:rPr>
+          <w:rFonts w:ascii="Consolas" w:cs="Consolas" w:eastAsia="Consolas" w:hAnsi="Consolas"/>
+          <w:b w:val="false"/>
+          <w:bCs w:val="false"/>
+          <w:color w:val="0F172A"/>
+          <w:sz w:val="18"/>
+          <w:szCs w:val="18"/>
+        </w:rPr>
+        <w:t xml:space="preserve"> CAT_CIRCUITOS_DISTRIBUCION </w:t>
+      </w:r>
+      <w:r>
+        <w:rPr>
+          <w:rFonts w:ascii="Calibri" w:cs="Calibri" w:eastAsia="Calibri" w:hAnsi="Calibri"/>
+          <w:b w:val="false"/>
+          <w:bCs w:val="false"/>
+          <w:color w:val="1E293B"/>
+          <w:sz w:val="20"/>
+          <w:szCs w:val="20"/>
+        </w:rPr>
+        <w:t xml:space="preserve">, </w:t>
+      </w:r>
+      <w:r>
+        <w:rPr>
+          <w:rFonts w:ascii="Consolas" w:cs="Consolas" w:eastAsia="Consolas" w:hAnsi="Consolas"/>
+          <w:b w:val="false"/>
+          <w:bCs w:val="false"/>
+          <w:color w:val="0F172A"/>
+          <w:sz w:val="18"/>
+          <w:szCs w:val="18"/>
+        </w:rPr>
+        <w:t xml:space="preserve"> CAT_NIVELES_TENSION </w:t>
+      </w:r>
+      <w:r>
+        <w:rPr>
+          <w:rFonts w:ascii="Calibri" w:cs="Calibri" w:eastAsia="Calibri" w:hAnsi="Calibri"/>
+          <w:b w:val="false"/>
+          <w:bCs w:val="false"/>
+          <w:color w:val="1E293B"/>
+          <w:sz w:val="20"/>
+          <w:szCs w:val="20"/>
+        </w:rPr>
+        <w:t xml:space="preserve">, </w:t>
+      </w:r>
+      <w:r>
+        <w:rPr>
+          <w:rFonts w:ascii="Consolas" w:cs="Consolas" w:eastAsia="Consolas" w:hAnsi="Consolas"/>
+          <w:b w:val="false"/>
+          <w:bCs w:val="false"/>
+          <w:color w:val="0F172A"/>
+          <w:sz w:val="18"/>
+          <w:szCs w:val="18"/>
+        </w:rPr>
+        <w:t xml:space="preserve"> CAT_TIPOS_EQUIPO_SCEIN </w:t>
+      </w:r>
+      <w:r>
+        <w:rPr>
+          <w:rFonts w:ascii="Calibri" w:cs="Calibri" w:eastAsia="Calibri" w:hAnsi="Calibri"/>
+          <w:b w:val="false"/>
+          <w:bCs w:val="false"/>
+          <w:color w:val="1E293B"/>
+          <w:sz w:val="20"/>
+          <w:szCs w:val="20"/>
+        </w:rPr>
+        <w:t xml:space="preserve">, </w:t>
+      </w:r>
+      <w:r>
+        <w:rPr>
+          <w:rFonts w:ascii="Consolas" w:cs="Consolas" w:eastAsia="Consolas" w:hAnsi="Consolas"/>
+          <w:b w:val="false"/>
+          <w:bCs w:val="false"/>
+          <w:color w:val="0F172A"/>
+          <w:sz w:val="18"/>
+          <w:szCs w:val="18"/>
+        </w:rPr>
+        <w:t xml:space="preserve"> CAT_MATERIALES_REPUESTOS </w:t>
+      </w:r>
+      <w:r>
+        <w:rPr>
+          <w:rFonts w:ascii="Calibri" w:cs="Calibri" w:eastAsia="Calibri" w:hAnsi="Calibri"/>
+          <w:b w:val="false"/>
+          <w:bCs w:val="false"/>
+          <w:color w:val="1E293B"/>
+          <w:sz w:val="20"/>
+          <w:szCs w:val="20"/>
+        </w:rPr>
+        <w:t xml:space="preserve">, etc.) que inyectan validaciones desplegables en Excel y en el formulario web reactivo.</w:t>
+      </w:r>
+    </w:p>
+    <w:p>
+      <w:pPr>
+        <w:spacing w:after="80" w:before="60"/>
+      </w:pPr>
+      <w:r>
+        <w:rPr>
+          <w:rFonts w:ascii="Calibri" w:cs="Calibri" w:eastAsia="Calibri" w:hAnsi="Calibri"/>
+          <w:b w:val="false"/>
+          <w:bCs w:val="false"/>
+          <w:color w:val="1E293B"/>
+          <w:sz w:val="20"/>
+          <w:szCs w:val="20"/>
+        </w:rPr>
+        <w:t xml:space="preserve">3. </w:t>
+      </w:r>
+      <w:r>
+        <w:rPr>
+          <w:rFonts w:ascii="Calibri" w:cs="Calibri" w:eastAsia="Calibri" w:hAnsi="Calibri"/>
+          <w:b/>
+          <w:bCs/>
+          <w:color w:val="002B49"/>
+          <w:sz w:val="20"/>
+          <w:szCs w:val="20"/>
+        </w:rPr>
+        <w:t xml:space="preserve">Persistencia Híbrida:</w:t>
+      </w:r>
+    </w:p>
+    <w:p>
+      <w:pPr>
+        <w:pStyle w:val="ListParagraph"/>
+        <w:numPr>
+          <w:ilvl w:val="0"/>
+          <w:numId w:val="1"/>
+        </w:numPr>
+        <w:spacing w:after="40" w:before="40"/>
+      </w:pPr>
+      <w:r>
+        <w:rPr>
+          <w:rFonts w:ascii="Calibri" w:cs="Calibri" w:eastAsia="Calibri" w:hAnsi="Calibri"/>
+          <w:b w:val="false"/>
+          <w:bCs w:val="false"/>
+          <w:color w:val="1E293B"/>
+          <w:sz w:val="20"/>
+          <w:szCs w:val="20"/>
+        </w:rPr>
+        <w:t xml:space="preserve">Almacenamiento estructurado en </w:t>
+      </w:r>
+      <w:r>
+        <w:rPr>
+          <w:rFonts w:ascii="Consolas" w:cs="Consolas" w:eastAsia="Consolas" w:hAnsi="Consolas"/>
+          <w:b w:val="false"/>
+          <w:bCs w:val="false"/>
+          <w:color w:val="0F172A"/>
+          <w:sz w:val="18"/>
+          <w:szCs w:val="18"/>
+        </w:rPr>
+        <w:t xml:space="preserve"> sigi.cat_procesos_ingesta </w:t>
+      </w:r>
+      <w:r>
+        <w:rPr>
+          <w:rFonts w:ascii="Calibri" w:cs="Calibri" w:eastAsia="Calibri" w:hAnsi="Calibri"/>
+          <w:b w:val="false"/>
+          <w:bCs w:val="false"/>
+          <w:color w:val="1E293B"/>
+          <w:sz w:val="20"/>
+          <w:szCs w:val="20"/>
+        </w:rPr>
+        <w:t xml:space="preserve"> y </w:t>
+      </w:r>
+      <w:r>
+        <w:rPr>
+          <w:rFonts w:ascii="Consolas" w:cs="Consolas" w:eastAsia="Consolas" w:hAnsi="Consolas"/>
+          <w:b w:val="false"/>
+          <w:bCs w:val="false"/>
+          <w:color w:val="0F172A"/>
+          <w:sz w:val="18"/>
+          <w:szCs w:val="18"/>
+        </w:rPr>
+        <w:t xml:space="preserve"> sigi.ingesta_registros_dinamicos </w:t>
+      </w:r>
+      <w:r>
+        <w:rPr>
+          <w:rFonts w:ascii="Calibri" w:cs="Calibri" w:eastAsia="Calibri" w:hAnsi="Calibri"/>
+          <w:b w:val="false"/>
+          <w:bCs w:val="false"/>
+          <w:color w:val="1E293B"/>
+          <w:sz w:val="20"/>
+          <w:szCs w:val="20"/>
+        </w:rPr>
+        <w:t xml:space="preserve"> con soporte </w:t>
+      </w:r>
+      <w:r>
+        <w:rPr>
+          <w:rFonts w:ascii="Consolas" w:cs="Consolas" w:eastAsia="Consolas" w:hAnsi="Consolas"/>
+          <w:b w:val="false"/>
+          <w:bCs w:val="false"/>
+          <w:color w:val="0F172A"/>
+          <w:sz w:val="18"/>
+          <w:szCs w:val="18"/>
+        </w:rPr>
+        <w:t xml:space="preserve"> JSONB </w:t>
+      </w:r>
+      <w:r>
+        <w:rPr>
+          <w:rFonts w:ascii="Calibri" w:cs="Calibri" w:eastAsia="Calibri" w:hAnsi="Calibri"/>
+          <w:b w:val="false"/>
+          <w:bCs w:val="false"/>
+          <w:color w:val="1E293B"/>
+          <w:sz w:val="20"/>
+          <w:szCs w:val="20"/>
+        </w:rPr>
+        <w:t xml:space="preserve"> de alta velocidad e indexación por lotes.</w:t>
       </w:r>
     </w:p>
     <w:sectPr>

</xml_diff>